<commit_message>
Add red-highlighted review items to Section 11 (Design Considerations)
Captured from screenshot as open items with named owners:
- In-flight malware scanning of every transfer
- Automatic quarantine of infected files
- AV scan max file size 250MB (Windows MDE)
- Encryption at rest (file store)
- Observability via Dynatrace (in-house instance)
- NRS: use departmental NRS (not the OOTB in-house one)
- Out-of-the-box protocols & connectors
- Headless architecture ~1,200 APIs (UI-less consumption)
Regenerated docx, index.html (HMRC-free) and docs.zip.
</commit_message>
<xml_diff>
--- a/assets/mft-capabilities-and-architecture.docx
+++ b/assets/mft-capabilities-and-architecture.docx
@@ -9205,6 +9205,694 @@
           </w:p>
         </w:tc>
       </w:tr>
+      <w:tr>
+        <w:tc>
+          <w:tcPr>
+            <w:tcW w:type="dxa" w:w="2400"/>
+            <w:shd w:fill="F2F2F2" w:color="auto" w:val="clear"/>
+            <w:tcMar>
+              <w:top w:type="dxa" w:w="60"/>
+              <w:left w:type="dxa" w:w="110"/>
+              <w:bottom w:type="dxa" w:w="60"/>
+              <w:right w:type="dxa" w:w="110"/>
+            </w:tcMar>
+          </w:tcPr>
+          <w:p>
+            <w:pPr>
+              <w:spacing w:after="0" w:line="264"/>
+            </w:pPr>
+            <w:r>
+              <w:rPr>
+                <w:rFonts w:ascii="Calibri" w:cs="Calibri" w:eastAsia="Calibri" w:hAnsi="Calibri"/>
+                <w:b/>
+                <w:bCs/>
+                <w:color w:val="222222"/>
+                <w:sz w:val="19"/>
+                <w:szCs w:val="19"/>
+              </w:rPr>
+              <w:t xml:space="preserve">In-flight malware scanning of every transfer</w:t>
+            </w:r>
+          </w:p>
+        </w:tc>
+        <w:tc>
+          <w:tcPr>
+            <w:tcW w:type="dxa" w:w="4740"/>
+            <w:shd w:fill="F2F2F2" w:color="auto" w:val="clear"/>
+            <w:tcMar>
+              <w:top w:type="dxa" w:w="60"/>
+              <w:left w:type="dxa" w:w="110"/>
+              <w:bottom w:type="dxa" w:w="60"/>
+              <w:right w:type="dxa" w:w="110"/>
+            </w:tcMar>
+          </w:tcPr>
+          <w:p>
+            <w:pPr>
+              <w:spacing w:after="0" w:line="264"/>
+            </w:pPr>
+            <w:r>
+              <w:rPr>
+                <w:rFonts w:ascii="Calibri" w:cs="Calibri" w:eastAsia="Calibri" w:hAnsi="Calibri"/>
+                <w:b w:val="false"/>
+                <w:bCs w:val="false"/>
+                <w:color w:val="222222"/>
+                <w:sz w:val="19"/>
+                <w:szCs w:val="19"/>
+              </w:rPr>
+              <w:t xml:space="preserve">Every file moving through the service is scanned in real time so malware and viruses are detected before delivery, not after. Confirm the scanning engine placement and throughput sizing against peak batch windows.</w:t>
+            </w:r>
+          </w:p>
+        </w:tc>
+        <w:tc>
+          <w:tcPr>
+            <w:tcW w:type="dxa" w:w="1700"/>
+            <w:shd w:fill="F2F2F2" w:color="auto" w:val="clear"/>
+            <w:tcMar>
+              <w:top w:type="dxa" w:w="60"/>
+              <w:left w:type="dxa" w:w="110"/>
+              <w:bottom w:type="dxa" w:w="60"/>
+              <w:right w:type="dxa" w:w="110"/>
+            </w:tcMar>
+          </w:tcPr>
+          <w:p>
+            <w:pPr>
+              <w:spacing w:after="0" w:line="264"/>
+            </w:pPr>
+            <w:r>
+              <w:rPr>
+                <w:rFonts w:ascii="Calibri" w:cs="Calibri" w:eastAsia="Calibri" w:hAnsi="Calibri"/>
+                <w:b w:val="false"/>
+                <w:bCs w:val="false"/>
+                <w:color w:val="222222"/>
+                <w:sz w:val="19"/>
+                <w:szCs w:val="19"/>
+              </w:rPr>
+              <w:t xml:space="preserve">Security Architecture</w:t>
+            </w:r>
+          </w:p>
+        </w:tc>
+      </w:tr>
+      <w:tr>
+        <w:tc>
+          <w:tcPr>
+            <w:tcW w:type="dxa" w:w="2400"/>
+            <w:shd w:fill="FFFFFF" w:color="auto" w:val="clear"/>
+            <w:tcMar>
+              <w:top w:type="dxa" w:w="60"/>
+              <w:left w:type="dxa" w:w="110"/>
+              <w:bottom w:type="dxa" w:w="60"/>
+              <w:right w:type="dxa" w:w="110"/>
+            </w:tcMar>
+          </w:tcPr>
+          <w:p>
+            <w:pPr>
+              <w:spacing w:after="0" w:line="264"/>
+            </w:pPr>
+            <w:r>
+              <w:rPr>
+                <w:rFonts w:ascii="Calibri" w:cs="Calibri" w:eastAsia="Calibri" w:hAnsi="Calibri"/>
+                <w:b/>
+                <w:bCs/>
+                <w:color w:val="222222"/>
+                <w:sz w:val="19"/>
+                <w:szCs w:val="19"/>
+              </w:rPr>
+              <w:t xml:space="preserve">Automatic quarantine of infected files</w:t>
+            </w:r>
+          </w:p>
+        </w:tc>
+        <w:tc>
+          <w:tcPr>
+            <w:tcW w:type="dxa" w:w="4740"/>
+            <w:shd w:fill="FFFFFF" w:color="auto" w:val="clear"/>
+            <w:tcMar>
+              <w:top w:type="dxa" w:w="60"/>
+              <w:left w:type="dxa" w:w="110"/>
+              <w:bottom w:type="dxa" w:w="60"/>
+              <w:right w:type="dxa" w:w="110"/>
+            </w:tcMar>
+          </w:tcPr>
+          <w:p>
+            <w:pPr>
+              <w:spacing w:after="0" w:line="264"/>
+            </w:pPr>
+            <w:r>
+              <w:rPr>
+                <w:rFonts w:ascii="Calibri" w:cs="Calibri" w:eastAsia="Calibri" w:hAnsi="Calibri"/>
+                <w:b w:val="false"/>
+                <w:bCs w:val="false"/>
+                <w:color w:val="222222"/>
+                <w:sz w:val="19"/>
+                <w:szCs w:val="19"/>
+              </w:rPr>
+              <w:t xml:space="preserve">On detection, the transfer is stopped and the file quarantined and flagged rather than delivered. Confirm the quarantine store location, retention and the notification/triage path for a flagged transfer.</w:t>
+            </w:r>
+          </w:p>
+        </w:tc>
+        <w:tc>
+          <w:tcPr>
+            <w:tcW w:type="dxa" w:w="1700"/>
+            <w:shd w:fill="FFFFFF" w:color="auto" w:val="clear"/>
+            <w:tcMar>
+              <w:top w:type="dxa" w:w="60"/>
+              <w:left w:type="dxa" w:w="110"/>
+              <w:bottom w:type="dxa" w:w="60"/>
+              <w:right w:type="dxa" w:w="110"/>
+            </w:tcMar>
+          </w:tcPr>
+          <w:p>
+            <w:pPr>
+              <w:spacing w:after="0" w:line="264"/>
+            </w:pPr>
+            <w:r>
+              <w:rPr>
+                <w:rFonts w:ascii="Calibri" w:cs="Calibri" w:eastAsia="Calibri" w:hAnsi="Calibri"/>
+                <w:b w:val="false"/>
+                <w:bCs w:val="false"/>
+                <w:color w:val="222222"/>
+                <w:sz w:val="19"/>
+                <w:szCs w:val="19"/>
+              </w:rPr>
+              <w:t xml:space="preserve">Security / Operations</w:t>
+            </w:r>
+          </w:p>
+        </w:tc>
+      </w:tr>
+      <w:tr>
+        <w:tc>
+          <w:tcPr>
+            <w:tcW w:type="dxa" w:w="2400"/>
+            <w:shd w:fill="F2F2F2" w:color="auto" w:val="clear"/>
+            <w:tcMar>
+              <w:top w:type="dxa" w:w="60"/>
+              <w:left w:type="dxa" w:w="110"/>
+              <w:bottom w:type="dxa" w:w="60"/>
+              <w:right w:type="dxa" w:w="110"/>
+            </w:tcMar>
+          </w:tcPr>
+          <w:p>
+            <w:pPr>
+              <w:spacing w:after="0" w:line="264"/>
+            </w:pPr>
+            <w:r>
+              <w:rPr>
+                <w:rFonts w:ascii="Calibri" w:cs="Calibri" w:eastAsia="Calibri" w:hAnsi="Calibri"/>
+                <w:b/>
+                <w:bCs/>
+                <w:color w:val="222222"/>
+                <w:sz w:val="19"/>
+                <w:szCs w:val="19"/>
+              </w:rPr>
+              <w:t xml:space="preserve">AV scan maximum file size — 250MB (Windows MDE)</w:t>
+            </w:r>
+          </w:p>
+        </w:tc>
+        <w:tc>
+          <w:tcPr>
+            <w:tcW w:type="dxa" w:w="4740"/>
+            <w:shd w:fill="F2F2F2" w:color="auto" w:val="clear"/>
+            <w:tcMar>
+              <w:top w:type="dxa" w:w="60"/>
+              <w:left w:type="dxa" w:w="110"/>
+              <w:bottom w:type="dxa" w:w="60"/>
+              <w:right w:type="dxa" w:w="110"/>
+            </w:tcMar>
+          </w:tcPr>
+          <w:p>
+            <w:pPr>
+              <w:spacing w:after="0" w:line="264"/>
+            </w:pPr>
+            <w:r>
+              <w:rPr>
+                <w:rFonts w:ascii="Calibri" w:cs="Calibri" w:eastAsia="Calibri" w:hAnsi="Calibri"/>
+                <w:b w:val="false"/>
+                <w:bCs w:val="false"/>
+                <w:color w:val="222222"/>
+                <w:sz w:val="19"/>
+                <w:szCs w:val="19"/>
+              </w:rPr>
+              <w:t xml:space="preserve">AV scanning via Windows MDE applies up to a 250MB maximum file size. Define the handling path for files above this limit (alternative scan, staged/chunked scan, or explicit exception with sign-off) so large transfers are not silently unscanned.</w:t>
+            </w:r>
+          </w:p>
+        </w:tc>
+        <w:tc>
+          <w:tcPr>
+            <w:tcW w:type="dxa" w:w="1700"/>
+            <w:shd w:fill="F2F2F2" w:color="auto" w:val="clear"/>
+            <w:tcMar>
+              <w:top w:type="dxa" w:w="60"/>
+              <w:left w:type="dxa" w:w="110"/>
+              <w:bottom w:type="dxa" w:w="60"/>
+              <w:right w:type="dxa" w:w="110"/>
+            </w:tcMar>
+          </w:tcPr>
+          <w:p>
+            <w:pPr>
+              <w:spacing w:after="0" w:line="264"/>
+            </w:pPr>
+            <w:r>
+              <w:rPr>
+                <w:rFonts w:ascii="Calibri" w:cs="Calibri" w:eastAsia="Calibri" w:hAnsi="Calibri"/>
+                <w:b w:val="false"/>
+                <w:bCs w:val="false"/>
+                <w:color w:val="222222"/>
+                <w:sz w:val="19"/>
+                <w:szCs w:val="19"/>
+              </w:rPr>
+              <w:t xml:space="preserve">Security Architecture</w:t>
+            </w:r>
+          </w:p>
+        </w:tc>
+      </w:tr>
+      <w:tr>
+        <w:tc>
+          <w:tcPr>
+            <w:tcW w:type="dxa" w:w="2400"/>
+            <w:shd w:fill="FFFFFF" w:color="auto" w:val="clear"/>
+            <w:tcMar>
+              <w:top w:type="dxa" w:w="60"/>
+              <w:left w:type="dxa" w:w="110"/>
+              <w:bottom w:type="dxa" w:w="60"/>
+              <w:right w:type="dxa" w:w="110"/>
+            </w:tcMar>
+          </w:tcPr>
+          <w:p>
+            <w:pPr>
+              <w:spacing w:after="0" w:line="264"/>
+            </w:pPr>
+            <w:r>
+              <w:rPr>
+                <w:rFonts w:ascii="Calibri" w:cs="Calibri" w:eastAsia="Calibri" w:hAnsi="Calibri"/>
+                <w:b/>
+                <w:bCs/>
+                <w:color w:val="222222"/>
+                <w:sz w:val="19"/>
+                <w:szCs w:val="19"/>
+              </w:rPr>
+              <w:t xml:space="preserve">Encryption at rest (file store)</w:t>
+            </w:r>
+          </w:p>
+        </w:tc>
+        <w:tc>
+          <w:tcPr>
+            <w:tcW w:type="dxa" w:w="4740"/>
+            <w:shd w:fill="FFFFFF" w:color="auto" w:val="clear"/>
+            <w:tcMar>
+              <w:top w:type="dxa" w:w="60"/>
+              <w:left w:type="dxa" w:w="110"/>
+              <w:bottom w:type="dxa" w:w="60"/>
+              <w:right w:type="dxa" w:w="110"/>
+            </w:tcMar>
+          </w:tcPr>
+          <w:p>
+            <w:pPr>
+              <w:spacing w:after="0" w:line="264"/>
+            </w:pPr>
+            <w:r>
+              <w:rPr>
+                <w:rFonts w:ascii="Calibri" w:cs="Calibri" w:eastAsia="Calibri" w:hAnsi="Calibri"/>
+                <w:b w:val="false"/>
+                <w:bCs w:val="false"/>
+                <w:color w:val="222222"/>
+                <w:sz w:val="19"/>
+                <w:szCs w:val="19"/>
+              </w:rPr>
+              <w:t xml:space="preserve">Files at rest in the platform file store are encrypted. Confirm the key-management model (platform-managed vs customer-managed keys) and rotation policy.</w:t>
+            </w:r>
+          </w:p>
+        </w:tc>
+        <w:tc>
+          <w:tcPr>
+            <w:tcW w:type="dxa" w:w="1700"/>
+            <w:shd w:fill="FFFFFF" w:color="auto" w:val="clear"/>
+            <w:tcMar>
+              <w:top w:type="dxa" w:w="60"/>
+              <w:left w:type="dxa" w:w="110"/>
+              <w:bottom w:type="dxa" w:w="60"/>
+              <w:right w:type="dxa" w:w="110"/>
+            </w:tcMar>
+          </w:tcPr>
+          <w:p>
+            <w:pPr>
+              <w:spacing w:after="0" w:line="264"/>
+            </w:pPr>
+            <w:r>
+              <w:rPr>
+                <w:rFonts w:ascii="Calibri" w:cs="Calibri" w:eastAsia="Calibri" w:hAnsi="Calibri"/>
+                <w:b w:val="false"/>
+                <w:bCs w:val="false"/>
+                <w:color w:val="222222"/>
+                <w:sz w:val="19"/>
+                <w:szCs w:val="19"/>
+              </w:rPr>
+              <w:t xml:space="preserve">Security Architecture</w:t>
+            </w:r>
+          </w:p>
+        </w:tc>
+      </w:tr>
+      <w:tr>
+        <w:tc>
+          <w:tcPr>
+            <w:tcW w:type="dxa" w:w="2400"/>
+            <w:shd w:fill="F2F2F2" w:color="auto" w:val="clear"/>
+            <w:tcMar>
+              <w:top w:type="dxa" w:w="60"/>
+              <w:left w:type="dxa" w:w="110"/>
+              <w:bottom w:type="dxa" w:w="60"/>
+              <w:right w:type="dxa" w:w="110"/>
+            </w:tcMar>
+          </w:tcPr>
+          <w:p>
+            <w:pPr>
+              <w:spacing w:after="0" w:line="264"/>
+            </w:pPr>
+            <w:r>
+              <w:rPr>
+                <w:rFonts w:ascii="Calibri" w:cs="Calibri" w:eastAsia="Calibri" w:hAnsi="Calibri"/>
+                <w:b/>
+                <w:bCs/>
+                <w:color w:val="222222"/>
+                <w:sz w:val="19"/>
+                <w:szCs w:val="19"/>
+              </w:rPr>
+              <w:t xml:space="preserve">Observability via Dynatrace</w:t>
+            </w:r>
+          </w:p>
+        </w:tc>
+        <w:tc>
+          <w:tcPr>
+            <w:tcW w:type="dxa" w:w="4740"/>
+            <w:shd w:fill="F2F2F2" w:color="auto" w:val="clear"/>
+            <w:tcMar>
+              <w:top w:type="dxa" w:w="60"/>
+              <w:left w:type="dxa" w:w="110"/>
+              <w:bottom w:type="dxa" w:w="60"/>
+              <w:right w:type="dxa" w:w="110"/>
+            </w:tcMar>
+          </w:tcPr>
+          <w:p>
+            <w:pPr>
+              <w:spacing w:after="0" w:line="264"/>
+            </w:pPr>
+            <w:r>
+              <w:rPr>
+                <w:rFonts w:ascii="Calibri" w:cs="Calibri" w:eastAsia="Calibri" w:hAnsi="Calibri"/>
+                <w:b w:val="false"/>
+                <w:bCs w:val="false"/>
+                <w:color w:val="222222"/>
+                <w:sz w:val="19"/>
+                <w:szCs w:val="19"/>
+              </w:rPr>
+              <w:t xml:space="preserve">Observability is provided through Dynatrace, using the existing in-house instance. Confirm agent coverage across the MFT runtime nodes and the metrics/alerts to be surfaced to operations.</w:t>
+            </w:r>
+          </w:p>
+        </w:tc>
+        <w:tc>
+          <w:tcPr>
+            <w:tcW w:type="dxa" w:w="1700"/>
+            <w:shd w:fill="F2F2F2" w:color="auto" w:val="clear"/>
+            <w:tcMar>
+              <w:top w:type="dxa" w:w="60"/>
+              <w:left w:type="dxa" w:w="110"/>
+              <w:bottom w:type="dxa" w:w="60"/>
+              <w:right w:type="dxa" w:w="110"/>
+            </w:tcMar>
+          </w:tcPr>
+          <w:p>
+            <w:pPr>
+              <w:spacing w:after="0" w:line="264"/>
+            </w:pPr>
+            <w:r>
+              <w:rPr>
+                <w:rFonts w:ascii="Calibri" w:cs="Calibri" w:eastAsia="Calibri" w:hAnsi="Calibri"/>
+                <w:b w:val="false"/>
+                <w:bCs w:val="false"/>
+                <w:color w:val="222222"/>
+                <w:sz w:val="19"/>
+                <w:szCs w:val="19"/>
+              </w:rPr>
+              <w:t xml:space="preserve">Platform Engineering</w:t>
+            </w:r>
+          </w:p>
+        </w:tc>
+      </w:tr>
+      <w:tr>
+        <w:tc>
+          <w:tcPr>
+            <w:tcW w:type="dxa" w:w="2400"/>
+            <w:shd w:fill="FFFFFF" w:color="auto" w:val="clear"/>
+            <w:tcMar>
+              <w:top w:type="dxa" w:w="60"/>
+              <w:left w:type="dxa" w:w="110"/>
+              <w:bottom w:type="dxa" w:w="60"/>
+              <w:right w:type="dxa" w:w="110"/>
+            </w:tcMar>
+          </w:tcPr>
+          <w:p>
+            <w:pPr>
+              <w:spacing w:after="0" w:line="264"/>
+            </w:pPr>
+            <w:r>
+              <w:rPr>
+                <w:rFonts w:ascii="Calibri" w:cs="Calibri" w:eastAsia="Calibri" w:hAnsi="Calibri"/>
+                <w:b/>
+                <w:bCs/>
+                <w:color w:val="222222"/>
+                <w:sz w:val="19"/>
+                <w:szCs w:val="19"/>
+              </w:rPr>
+              <w:t xml:space="preserve">Notification &amp; Reporting Service (NRS) — use departmental NRS</w:t>
+            </w:r>
+          </w:p>
+        </w:tc>
+        <w:tc>
+          <w:tcPr>
+            <w:tcW w:type="dxa" w:w="4740"/>
+            <w:shd w:fill="FFFFFF" w:color="auto" w:val="clear"/>
+            <w:tcMar>
+              <w:top w:type="dxa" w:w="60"/>
+              <w:left w:type="dxa" w:w="110"/>
+              <w:bottom w:type="dxa" w:w="60"/>
+              <w:right w:type="dxa" w:w="110"/>
+            </w:tcMar>
+          </w:tcPr>
+          <w:p>
+            <w:pPr>
+              <w:spacing w:after="0" w:line="264"/>
+            </w:pPr>
+            <w:r>
+              <w:rPr>
+                <w:rFonts w:ascii="Calibri" w:cs="Calibri" w:eastAsia="Calibri" w:hAnsi="Calibri"/>
+                <w:b w:val="false"/>
+                <w:bCs w:val="false"/>
+                <w:color w:val="222222"/>
+                <w:sz w:val="19"/>
+                <w:szCs w:val="19"/>
+              </w:rPr>
+              <w:t xml:space="preserve">Although the platform provides an out-of-the-box NRS in-house, it is not for current use; integrate with the departmental NRS instead. Confirm the integration contract and message model with the NRS owner.</w:t>
+            </w:r>
+          </w:p>
+        </w:tc>
+        <w:tc>
+          <w:tcPr>
+            <w:tcW w:type="dxa" w:w="1700"/>
+            <w:shd w:fill="FFFFFF" w:color="auto" w:val="clear"/>
+            <w:tcMar>
+              <w:top w:type="dxa" w:w="60"/>
+              <w:left w:type="dxa" w:w="110"/>
+              <w:bottom w:type="dxa" w:w="60"/>
+              <w:right w:type="dxa" w:w="110"/>
+            </w:tcMar>
+          </w:tcPr>
+          <w:p>
+            <w:pPr>
+              <w:spacing w:after="0" w:line="264"/>
+            </w:pPr>
+            <w:r>
+              <w:rPr>
+                <w:rFonts w:ascii="Calibri" w:cs="Calibri" w:eastAsia="Calibri" w:hAnsi="Calibri"/>
+                <w:b w:val="false"/>
+                <w:bCs w:val="false"/>
+                <w:color w:val="222222"/>
+                <w:sz w:val="19"/>
+                <w:szCs w:val="19"/>
+              </w:rPr>
+              <w:t xml:space="preserve">Integration Architecture</w:t>
+            </w:r>
+          </w:p>
+        </w:tc>
+      </w:tr>
+      <w:tr>
+        <w:tc>
+          <w:tcPr>
+            <w:tcW w:type="dxa" w:w="2400"/>
+            <w:shd w:fill="F2F2F2" w:color="auto" w:val="clear"/>
+            <w:tcMar>
+              <w:top w:type="dxa" w:w="60"/>
+              <w:left w:type="dxa" w:w="110"/>
+              <w:bottom w:type="dxa" w:w="60"/>
+              <w:right w:type="dxa" w:w="110"/>
+            </w:tcMar>
+          </w:tcPr>
+          <w:p>
+            <w:pPr>
+              <w:spacing w:after="0" w:line="264"/>
+            </w:pPr>
+            <w:r>
+              <w:rPr>
+                <w:rFonts w:ascii="Calibri" w:cs="Calibri" w:eastAsia="Calibri" w:hAnsi="Calibri"/>
+                <w:b/>
+                <w:bCs/>
+                <w:color w:val="222222"/>
+                <w:sz w:val="19"/>
+                <w:szCs w:val="19"/>
+              </w:rPr>
+              <w:t xml:space="preserve">Out-of-the-box protocols &amp; connectors</w:t>
+            </w:r>
+          </w:p>
+        </w:tc>
+        <w:tc>
+          <w:tcPr>
+            <w:tcW w:type="dxa" w:w="4740"/>
+            <w:shd w:fill="F2F2F2" w:color="auto" w:val="clear"/>
+            <w:tcMar>
+              <w:top w:type="dxa" w:w="60"/>
+              <w:left w:type="dxa" w:w="110"/>
+              <w:bottom w:type="dxa" w:w="60"/>
+              <w:right w:type="dxa" w:w="110"/>
+            </w:tcMar>
+          </w:tcPr>
+          <w:p>
+            <w:pPr>
+              <w:spacing w:after="0" w:line="264"/>
+            </w:pPr>
+            <w:r>
+              <w:rPr>
+                <w:rFonts w:ascii="Calibri" w:cs="Calibri" w:eastAsia="Calibri" w:hAnsi="Calibri"/>
+                <w:b w:val="false"/>
+                <w:bCs w:val="false"/>
+                <w:color w:val="222222"/>
+                <w:sz w:val="19"/>
+                <w:szCs w:val="19"/>
+              </w:rPr>
+              <w:t xml:space="preserve">Standard protocols and connectors are used out of the box rather than bespoke builds, consistent with config-over-construction. Confirm the approved connector/protocol list and that no interface forces a custom connector.</w:t>
+            </w:r>
+          </w:p>
+        </w:tc>
+        <w:tc>
+          <w:tcPr>
+            <w:tcW w:type="dxa" w:w="1700"/>
+            <w:shd w:fill="F2F2F2" w:color="auto" w:val="clear"/>
+            <w:tcMar>
+              <w:top w:type="dxa" w:w="60"/>
+              <w:left w:type="dxa" w:w="110"/>
+              <w:bottom w:type="dxa" w:w="60"/>
+              <w:right w:type="dxa" w:w="110"/>
+            </w:tcMar>
+          </w:tcPr>
+          <w:p>
+            <w:pPr>
+              <w:spacing w:after="0" w:line="264"/>
+            </w:pPr>
+            <w:r>
+              <w:rPr>
+                <w:rFonts w:ascii="Calibri" w:cs="Calibri" w:eastAsia="Calibri" w:hAnsi="Calibri"/>
+                <w:b w:val="false"/>
+                <w:bCs w:val="false"/>
+                <w:color w:val="222222"/>
+                <w:sz w:val="19"/>
+                <w:szCs w:val="19"/>
+              </w:rPr>
+              <w:t xml:space="preserve">Integration Architecture</w:t>
+            </w:r>
+          </w:p>
+        </w:tc>
+      </w:tr>
+      <w:tr>
+        <w:tc>
+          <w:tcPr>
+            <w:tcW w:type="dxa" w:w="2400"/>
+            <w:shd w:fill="FFFFFF" w:color="auto" w:val="clear"/>
+            <w:tcMar>
+              <w:top w:type="dxa" w:w="60"/>
+              <w:left w:type="dxa" w:w="110"/>
+              <w:bottom w:type="dxa" w:w="60"/>
+              <w:right w:type="dxa" w:w="110"/>
+            </w:tcMar>
+          </w:tcPr>
+          <w:p>
+            <w:pPr>
+              <w:spacing w:after="0" w:line="264"/>
+            </w:pPr>
+            <w:r>
+              <w:rPr>
+                <w:rFonts w:ascii="Calibri" w:cs="Calibri" w:eastAsia="Calibri" w:hAnsi="Calibri"/>
+                <w:b/>
+                <w:bCs/>
+                <w:color w:val="222222"/>
+                <w:sz w:val="19"/>
+                <w:szCs w:val="19"/>
+              </w:rPr>
+              <w:t xml:space="preserve">Headless architecture — ~1,200 APIs</w:t>
+            </w:r>
+          </w:p>
+        </w:tc>
+        <w:tc>
+          <w:tcPr>
+            <w:tcW w:type="dxa" w:w="4740"/>
+            <w:shd w:fill="FFFFFF" w:color="auto" w:val="clear"/>
+            <w:tcMar>
+              <w:top w:type="dxa" w:w="60"/>
+              <w:left w:type="dxa" w:w="110"/>
+              <w:bottom w:type="dxa" w:w="60"/>
+              <w:right w:type="dxa" w:w="110"/>
+            </w:tcMar>
+          </w:tcPr>
+          <w:p>
+            <w:pPr>
+              <w:spacing w:after="0" w:line="264"/>
+            </w:pPr>
+            <w:r>
+              <w:rPr>
+                <w:rFonts w:ascii="Calibri" w:cs="Calibri" w:eastAsia="Calibri" w:hAnsi="Calibri"/>
+                <w:b w:val="false"/>
+                <w:bCs w:val="false"/>
+                <w:color w:val="222222"/>
+                <w:sz w:val="19"/>
+                <w:szCs w:val="19"/>
+              </w:rPr>
+              <w:t xml:space="preserve">The platform exposes on the order of 1,200 APIs that can be consumed directly without the UI, enabling full headless / programmatic operation (the foundation for Intelligrator automation). Confirm which of these are in scope for self-service provisioning and their governance/security wrapping.</w:t>
+            </w:r>
+          </w:p>
+        </w:tc>
+        <w:tc>
+          <w:tcPr>
+            <w:tcW w:type="dxa" w:w="1700"/>
+            <w:shd w:fill="FFFFFF" w:color="auto" w:val="clear"/>
+            <w:tcMar>
+              <w:top w:type="dxa" w:w="60"/>
+              <w:left w:type="dxa" w:w="110"/>
+              <w:bottom w:type="dxa" w:w="60"/>
+              <w:right w:type="dxa" w:w="110"/>
+            </w:tcMar>
+          </w:tcPr>
+          <w:p>
+            <w:pPr>
+              <w:spacing w:after="0" w:line="264"/>
+            </w:pPr>
+            <w:r>
+              <w:rPr>
+                <w:rFonts w:ascii="Calibri" w:cs="Calibri" w:eastAsia="Calibri" w:hAnsi="Calibri"/>
+                <w:b w:val="false"/>
+                <w:bCs w:val="false"/>
+                <w:color w:val="222222"/>
+                <w:sz w:val="19"/>
+                <w:szCs w:val="19"/>
+              </w:rPr>
+              <w:t xml:space="preserve">Product / Integration Architecture</w:t>
+            </w:r>
+          </w:p>
+        </w:tc>
+      </w:tr>
     </w:tbl>
     <w:p>
       <w:pPr>

</xml_diff>